<commit_message>
Pack 33.6: fix employer_letter_template.docx - dynamic duties from position.duties
</commit_message>
<xml_diff>
--- a/templates/docx/employer_letter_template.docx
+++ b/templates/docx/employer_letter_template.docx
@@ -368,7 +368,7 @@
         <w:jc w:val="both"/>
       </w:pPr>
       <w:r>
-        <w:t>Камеральная обработка результатов измерений;</w:t>
+        <w:t xml:space="preserve">{%p for duty in position.duties or [] %}</w:t>
       </w:r>
     </w:p>
     <w:p>
@@ -379,23 +379,7 @@
         <w:jc w:val="both"/>
       </w:pPr>
       <w:r>
-        <w:t xml:space="preserve">Отрисовка инженерно-топографического плана по облаку точек в </w:t>
-      </w:r>
-      <w:proofErr w:type="spellStart"/>
-      <w:r>
-        <w:t>автокад</w:t>
-      </w:r>
-      <w:proofErr w:type="spellEnd"/>
-      <w:r>
-        <w:t xml:space="preserve"> (</w:t>
-      </w:r>
-      <w:proofErr w:type="spellStart"/>
-      <w:r>
-        <w:t>АкадТопоПлан</w:t>
-      </w:r>
-      <w:proofErr w:type="spellEnd"/>
-      <w:r>
-        <w:t>);</w:t>
+        <w:t xml:space="preserve">{{ duty }}</w:t>
       </w:r>
     </w:p>
     <w:p>
@@ -406,95 +390,7 @@
         <w:jc w:val="both"/>
       </w:pPr>
       <w:r>
-        <w:t>Отрисовка инженерно-топографических планов по абрисам/кодам;</w:t>
-      </w:r>
-    </w:p>
-    <w:p>
-      <w:pPr>
-        <w:pStyle w:val="a3"/>
-        <w:spacing w:line="253" w:lineRule="exact"/>
-        <w:ind w:right="-574" w:firstLine="720"/>
-        <w:jc w:val="both"/>
-      </w:pPr>
-      <w:r>
-        <w:t>Отрисовка топографического плана по данным аэрофотосъемки (ортофотоплан);</w:t>
-      </w:r>
-    </w:p>
-    <w:p>
-      <w:pPr>
-        <w:pStyle w:val="a3"/>
-        <w:spacing w:line="253" w:lineRule="exact"/>
-        <w:ind w:right="-574" w:firstLine="720"/>
-        <w:jc w:val="both"/>
-      </w:pPr>
-      <w:r>
-        <w:t>Обработка и корректировка материалов инженерно-геодезических изысканий, исходя из замечаний экспертизы;</w:t>
-      </w:r>
-    </w:p>
-    <w:p>
-      <w:pPr>
-        <w:pStyle w:val="a3"/>
-        <w:spacing w:line="253" w:lineRule="exact"/>
-        <w:ind w:right="-574" w:firstLine="720"/>
-        <w:jc w:val="both"/>
-      </w:pPr>
-      <w:r>
-        <w:t>Подготовка схемы посадки и выноса в натуру осей здания;</w:t>
-      </w:r>
-    </w:p>
-    <w:p>
-      <w:pPr>
-        <w:pStyle w:val="a3"/>
-        <w:spacing w:line="253" w:lineRule="exact"/>
-        <w:ind w:right="-574" w:firstLine="720"/>
-        <w:jc w:val="both"/>
-      </w:pPr>
-      <w:r>
-        <w:t>Взаимодействие с согласователем: корректировка файла, с учетом проведенных согласований; отслеживание полноты и правильности нанесения подземных инженерных коммуникаций;</w:t>
-      </w:r>
-    </w:p>
-    <w:p>
-      <w:pPr>
-        <w:pStyle w:val="a3"/>
-        <w:spacing w:line="253" w:lineRule="exact"/>
-        <w:ind w:right="-574" w:firstLine="720"/>
-        <w:jc w:val="both"/>
-      </w:pPr>
-      <w:r>
-        <w:t>Подготовка технического отчета по инженерно-геодезическим изысканиям;</w:t>
-      </w:r>
-    </w:p>
-    <w:p>
-      <w:pPr>
-        <w:pStyle w:val="a3"/>
-        <w:spacing w:line="253" w:lineRule="exact"/>
-        <w:ind w:right="-574" w:firstLine="720"/>
-        <w:jc w:val="both"/>
-      </w:pPr>
-      <w:r>
-        <w:t>Подготовка и составление исполнительных схем для сдачи исполнительной документации;</w:t>
-      </w:r>
-    </w:p>
-    <w:p>
-      <w:pPr>
-        <w:pStyle w:val="a3"/>
-        <w:spacing w:line="253" w:lineRule="exact"/>
-        <w:ind w:right="-574" w:firstLine="720"/>
-        <w:jc w:val="both"/>
-      </w:pPr>
-      <w:r>
-        <w:t>Подсчет объёмов работ, сверка объемов проекта с физически выполненными объемами;</w:t>
-      </w:r>
-    </w:p>
-    <w:p>
-      <w:pPr>
-        <w:pStyle w:val="a3"/>
-        <w:spacing w:line="253" w:lineRule="exact"/>
-        <w:ind w:right="-574" w:firstLine="720"/>
-        <w:jc w:val="both"/>
-      </w:pPr>
-      <w:r>
-        <w:t>Составление и ведение реестра, накопительных ведомостей и накопительной схемы выполненных работ.</w:t>
+        <w:t xml:space="preserve">{%p endfor %}</w:t>
       </w:r>
     </w:p>
     <w:p>

</xml_diff>